<commit_message>
fine tuning for submission
</commit_message>
<xml_diff>
--- a/Code/AspenHabitat-TitlePage.docx
+++ b/Code/AspenHabitat-TitlePage.docx
@@ -52,25 +52,51 @@
     <w:p>
       <w:pPr>
         <w:pStyle w:val="FirstParagraph"/>
-      </w:pPr>
-      <w:hyperlink r:id="rId7">
-        <w:r>
-          <w:rPr>
-            <w:rStyle w:val="Hyperlink"/>
-          </w:rPr>
-          <w:t>Sarah J. Hart</w:t>
-        </w:r>
-      </w:hyperlink>
+        <w:ind w:firstLine="0"/>
+      </w:pPr>
+      <w:r>
+        <w:fldChar w:fldCharType="begin"/>
+      </w:r>
+      <w:r>
+        <w:instrText>HYPERLINK "https://orcid.org/0000-0001-8371-8568" \h</w:instrText>
+      </w:r>
+      <w:r>
+        <w:fldChar w:fldCharType="separate"/>
+      </w:r>
+      <w:r>
+        <w:rPr>
+          <w:rStyle w:val="Hyperlink"/>
+        </w:rPr>
+        <w:t>Sa</w:t>
+      </w:r>
+      <w:r>
+        <w:rPr>
+          <w:rStyle w:val="Hyperlink"/>
+        </w:rPr>
+        <w:t>a</w:t>
+      </w:r>
+      <w:r>
+        <w:rPr>
+          <w:rStyle w:val="Hyperlink"/>
+        </w:rPr>
+        <w:t>h J. Hart</w:t>
+      </w:r>
+      <w:r>
+        <w:rPr>
+          <w:rStyle w:val="Hyperlink"/>
+        </w:rPr>
+        <w:fldChar w:fldCharType="end"/>
+      </w:r>
       <w:r>
         <w:rPr>
           <w:vertAlign w:val="superscript"/>
         </w:rPr>
-        <w:t>a</w:t>
+        <w:t>a,1</w:t>
       </w:r>
       <w:r>
         <w:t xml:space="preserve">, </w:t>
       </w:r>
-      <w:hyperlink r:id="rId8">
+      <w:hyperlink r:id="rId7">
         <w:r>
           <w:rPr>
             <w:rStyle w:val="Hyperlink"/>
@@ -87,7 +113,7 @@
       <w:r>
         <w:t xml:space="preserve">, and </w:t>
       </w:r>
-      <w:hyperlink r:id="rId9">
+      <w:hyperlink r:id="rId8">
         <w:r>
           <w:rPr>
             <w:rStyle w:val="Hyperlink"/>
@@ -141,6 +167,15 @@
     </w:p>
     <w:p>
       <w:pPr>
+        <w:pStyle w:val="BodyText"/>
+        <w:ind w:firstLine="0"/>
+      </w:pPr>
+      <w:r>
+        <w:t>1 - corresponding author; email address: Sarah.Hart@colostate.edu</w:t>
+      </w:r>
+    </w:p>
+    <w:p>
+      <w:pPr>
         <w:pStyle w:val="Heading1"/>
       </w:pPr>
       <w:bookmarkStart w:id="4" w:name="funding-information"/>
@@ -152,6 +187,7 @@
     <w:p>
       <w:pPr>
         <w:pStyle w:val="FirstParagraph"/>
+        <w:ind w:firstLine="0"/>
       </w:pPr>
       <w:r>
         <w:t>This research was funded by the Joint Fire Science Program (JFSP, Project ID 21-2-02-29).</w:t>
@@ -239,50 +275,16 @@
         <w:ind w:firstLine="0"/>
       </w:pPr>
       <w:r>
-        <w:t>Code and maps of the predicted habitat suitability area available through Dryad via the following anonymized link:</w:t>
+        <w:t xml:space="preserve">Code and maps of the predicted habitat suitability area available through Dryad via the following anonymized link: </w:t>
       </w:r>
-      <w:r>
-        <w:rPr>
-          <w:i/>
-        </w:rPr>
-        <w:fldChar w:fldCharType="begin"/>
-      </w:r>
-      <w:r>
-        <w:rPr>
-          <w:i/>
-        </w:rPr>
-        <w:instrText>HYPERLINK "</w:instrText>
-      </w:r>
-      <w:r>
-        <w:rPr>
-          <w:i/>
-        </w:rPr>
-        <w:instrText>http://datadryad.org/stash/share/gGubdiD6hCORznmbeHB6gkWoxodyj25Soa3s3yfOfHg</w:instrText>
-      </w:r>
-      <w:r>
-        <w:rPr>
-          <w:i/>
-        </w:rPr>
-        <w:instrText>"</w:instrText>
-      </w:r>
-      <w:r>
-        <w:rPr>
-          <w:i/>
-        </w:rPr>
-        <w:fldChar w:fldCharType="separate"/>
-      </w:r>
-      <w:r>
-        <w:rPr>
-          <w:rStyle w:val="Hyperlink"/>
-        </w:rPr>
-        <w:t>http://datadryad.org/stash/share/gGubdiD6hCORznmbeHB6gkWoxodyj25Soa3s3yfOfHg</w:t>
-      </w:r>
-      <w:r>
-        <w:rPr>
-          <w:i/>
-        </w:rPr>
-        <w:fldChar w:fldCharType="end"/>
-      </w:r>
+      <w:hyperlink r:id="rId9">
+        <w:r>
+          <w:rPr>
+            <w:rStyle w:val="Hyperlink"/>
+          </w:rPr>
+          <w:t>http://datadryad.org/stash/share/gGubdiD6hCORznmbeHB6gkWoxodyj25Soa3s3yfOfHg</w:t>
+        </w:r>
+      </w:hyperlink>
       <w:r>
         <w:t>.</w:t>
       </w:r>
@@ -2513,7 +2515,7 @@
   <w:num w:numId="475" w16cid:durableId="675226135">
     <w:abstractNumId w:val="9"/>
   </w:num>
-  <w:num w:numId="476" w16cid:durableId="1168791356">
+  <w:num w:numId="476" w16cid:durableId="1593202815">
     <w:abstractNumId w:val="10"/>
   </w:num>
 </w:numbering>
@@ -3827,22 +3829,10 @@
     <w:basedOn w:val="DefaultParagraphFont"/>
     <w:semiHidden/>
     <w:unhideWhenUsed/>
-    <w:rsid w:val="00DE18A5"/>
+    <w:rsid w:val="0050015E"/>
     <w:rPr>
       <w:color w:val="800080" w:themeColor="followedHyperlink"/>
       <w:u w:val="single"/>
-    </w:rPr>
-  </w:style>
-  <w:style w:type="character" w:styleId="UnresolvedMention">
-    <w:name w:val="Unresolved Mention"/>
-    <w:basedOn w:val="DefaultParagraphFont"/>
-    <w:uiPriority w:val="99"/>
-    <w:semiHidden/>
-    <w:unhideWhenUsed/>
-    <w:rsid w:val="00DE18A5"/>
-    <w:rPr>
-      <w:color w:val="605E5C"/>
-      <w:shd w:val="clear" w:color="auto" w:fill="E1DFDD"/>
     </w:rPr>
   </w:style>
 </w:styles>

</xml_diff>